<commit_message>
Atualizações - Sprint 4
</commit_message>
<xml_diff>
--- a/Documentação/Projeto_Gestão_Manutenção_Predial1.docx
+++ b/Documentação/Projeto_Gestão_Manutenção_Predial1.docx
@@ -424,7 +424,7 @@
             </w:rPr>
             <w:fldChar w:fldCharType="separate"/>
           </w:r>
-          <w:hyperlink w:anchor="_Toc225951986" w:history="1">
+          <w:hyperlink w:anchor="_Toc227070574" w:history="1">
             <w:r>
               <w:rPr>
                 <w:rStyle w:val="Hyperlink"/>
@@ -474,7 +474,7 @@
                 <w:noProof/>
                 <w:webHidden/>
               </w:rPr>
-              <w:instrText xml:space="preserve"> PAGEREF _Toc225951986 \h </w:instrText>
+              <w:instrText xml:space="preserve"> PAGEREF _Toc227070574 \h </w:instrText>
             </w:r>
             <w:r>
               <w:rPr>
@@ -522,7 +522,7 @@
               <w14:ligatures w14:val="standardContextual"/>
             </w:rPr>
           </w:pPr>
-          <w:hyperlink w:anchor="_Toc225951987" w:history="1">
+          <w:hyperlink w:anchor="_Toc227070575" w:history="1">
             <w:r>
               <w:rPr>
                 <w:rStyle w:val="Hyperlink"/>
@@ -572,7 +572,7 @@
                 <w:noProof/>
                 <w:webHidden/>
               </w:rPr>
-              <w:instrText xml:space="preserve"> PAGEREF _Toc225951987 \h </w:instrText>
+              <w:instrText xml:space="preserve"> PAGEREF _Toc227070575 \h </w:instrText>
             </w:r>
             <w:r>
               <w:rPr>
@@ -620,7 +620,7 @@
               <w14:ligatures w14:val="standardContextual"/>
             </w:rPr>
           </w:pPr>
-          <w:hyperlink w:anchor="_Toc225951988" w:history="1">
+          <w:hyperlink w:anchor="_Toc227070576" w:history="1">
             <w:r>
               <w:rPr>
                 <w:rStyle w:val="Hyperlink"/>
@@ -670,7 +670,7 @@
                 <w:noProof/>
                 <w:webHidden/>
               </w:rPr>
-              <w:instrText xml:space="preserve"> PAGEREF _Toc225951988 \h </w:instrText>
+              <w:instrText xml:space="preserve"> PAGEREF _Toc227070576 \h </w:instrText>
             </w:r>
             <w:r>
               <w:rPr>
@@ -718,7 +718,7 @@
               <w14:ligatures w14:val="standardContextual"/>
             </w:rPr>
           </w:pPr>
-          <w:hyperlink w:anchor="_Toc225951989" w:history="1">
+          <w:hyperlink w:anchor="_Toc227070577" w:history="1">
             <w:r>
               <w:rPr>
                 <w:rStyle w:val="Hyperlink"/>
@@ -767,7 +767,7 @@
                 <w:noProof/>
                 <w:webHidden/>
               </w:rPr>
-              <w:instrText xml:space="preserve"> PAGEREF _Toc225951989 \h </w:instrText>
+              <w:instrText xml:space="preserve"> PAGEREF _Toc227070577 \h </w:instrText>
             </w:r>
             <w:r>
               <w:rPr>
@@ -815,7 +815,7 @@
               <w14:ligatures w14:val="standardContextual"/>
             </w:rPr>
           </w:pPr>
-          <w:hyperlink w:anchor="_Toc225951990" w:history="1">
+          <w:hyperlink w:anchor="_Toc227070578" w:history="1">
             <w:r>
               <w:rPr>
                 <w:rStyle w:val="Hyperlink"/>
@@ -864,7 +864,7 @@
                 <w:noProof/>
                 <w:webHidden/>
               </w:rPr>
-              <w:instrText xml:space="preserve"> PAGEREF _Toc225951990 \h </w:instrText>
+              <w:instrText xml:space="preserve"> PAGEREF _Toc227070578 \h </w:instrText>
             </w:r>
             <w:r>
               <w:rPr>
@@ -912,7 +912,7 @@
               <w14:ligatures w14:val="standardContextual"/>
             </w:rPr>
           </w:pPr>
-          <w:hyperlink w:anchor="_Toc225951991" w:history="1">
+          <w:hyperlink w:anchor="_Toc227070579" w:history="1">
             <w:r>
               <w:rPr>
                 <w:rStyle w:val="Hyperlink"/>
@@ -961,7 +961,7 @@
                 <w:noProof/>
                 <w:webHidden/>
               </w:rPr>
-              <w:instrText xml:space="preserve"> PAGEREF _Toc225951991 \h </w:instrText>
+              <w:instrText xml:space="preserve"> PAGEREF _Toc227070579 \h </w:instrText>
             </w:r>
             <w:r>
               <w:rPr>
@@ -1009,7 +1009,7 @@
               <w14:ligatures w14:val="standardContextual"/>
             </w:rPr>
           </w:pPr>
-          <w:hyperlink w:anchor="_Toc225951992" w:history="1">
+          <w:hyperlink w:anchor="_Toc227070580" w:history="1">
             <w:r>
               <w:rPr>
                 <w:rStyle w:val="Hyperlink"/>
@@ -1059,7 +1059,7 @@
                 <w:noProof/>
                 <w:webHidden/>
               </w:rPr>
-              <w:instrText xml:space="preserve"> PAGEREF _Toc225951992 \h </w:instrText>
+              <w:instrText xml:space="preserve"> PAGEREF _Toc227070580 \h </w:instrText>
             </w:r>
             <w:r>
               <w:rPr>
@@ -1107,7 +1107,7 @@
               <w14:ligatures w14:val="standardContextual"/>
             </w:rPr>
           </w:pPr>
-          <w:hyperlink w:anchor="_Toc225951993" w:history="1">
+          <w:hyperlink w:anchor="_Toc227070581" w:history="1">
             <w:r>
               <w:rPr>
                 <w:rStyle w:val="Hyperlink"/>
@@ -1157,7 +1157,7 @@
                 <w:noProof/>
                 <w:webHidden/>
               </w:rPr>
-              <w:instrText xml:space="preserve"> PAGEREF _Toc225951993 \h </w:instrText>
+              <w:instrText xml:space="preserve"> PAGEREF _Toc227070581 \h </w:instrText>
             </w:r>
             <w:r>
               <w:rPr>
@@ -1205,7 +1205,7 @@
               <w14:ligatures w14:val="standardContextual"/>
             </w:rPr>
           </w:pPr>
-          <w:hyperlink w:anchor="_Toc225951994" w:history="1">
+          <w:hyperlink w:anchor="_Toc227070582" w:history="1">
             <w:r>
               <w:rPr>
                 <w:rStyle w:val="Hyperlink"/>
@@ -1255,7 +1255,7 @@
                 <w:noProof/>
                 <w:webHidden/>
               </w:rPr>
-              <w:instrText xml:space="preserve"> PAGEREF _Toc225951994 \h </w:instrText>
+              <w:instrText xml:space="preserve"> PAGEREF _Toc227070582 \h </w:instrText>
             </w:r>
             <w:r>
               <w:rPr>
@@ -1275,7 +1275,7 @@
                 <w:noProof/>
                 <w:webHidden/>
               </w:rPr>
-              <w:t>5</w:t>
+              <w:t>6</w:t>
             </w:r>
             <w:r>
               <w:rPr>
@@ -1303,7 +1303,7 @@
               <w14:ligatures w14:val="standardContextual"/>
             </w:rPr>
           </w:pPr>
-          <w:hyperlink w:anchor="_Toc225951995" w:history="1">
+          <w:hyperlink w:anchor="_Toc227070583" w:history="1">
             <w:r>
               <w:rPr>
                 <w:rStyle w:val="Hyperlink"/>
@@ -1353,7 +1353,7 @@
                 <w:noProof/>
                 <w:webHidden/>
               </w:rPr>
-              <w:instrText xml:space="preserve"> PAGEREF _Toc225951995 \h </w:instrText>
+              <w:instrText xml:space="preserve"> PAGEREF _Toc227070583 \h </w:instrText>
             </w:r>
             <w:r>
               <w:rPr>
@@ -1373,7 +1373,105 @@
                 <w:noProof/>
                 <w:webHidden/>
               </w:rPr>
-              <w:t>5</w:t>
+              <w:t>6</w:t>
+            </w:r>
+            <w:r>
+              <w:rPr>
+                <w:noProof/>
+                <w:webHidden/>
+              </w:rPr>
+              <w:fldChar w:fldCharType="end"/>
+            </w:r>
+          </w:hyperlink>
+        </w:p>
+        <w:p>
+          <w:pPr>
+            <w:pStyle w:val="Sumrio2"/>
+            <w:tabs>
+              <w:tab w:val="left" w:pos="960"/>
+              <w:tab w:val="right" w:leader="dot" w:pos="8494"/>
+            </w:tabs>
+            <w:rPr>
+              <w:rFonts w:eastAsiaTheme="minorEastAsia"/>
+              <w:noProof/>
+              <w:kern w:val="2"/>
+              <w:sz w:val="24"/>
+              <w:szCs w:val="24"/>
+              <w:lang w:eastAsia="pt-BR"/>
+              <w14:ligatures w14:val="standardContextual"/>
+            </w:rPr>
+          </w:pPr>
+          <w:hyperlink w:anchor="_Toc227070584" w:history="1">
+            <w:r>
+              <w:rPr>
+                <w:rStyle w:val="Hyperlink"/>
+                <w:rFonts w:ascii="Times New Roman" w:hAnsi="Times New Roman" w:cs="Times New Roman"/>
+                <w:i/>
+                <w:noProof/>
+              </w:rPr>
+              <w:t>5.2.</w:t>
+            </w:r>
+            <w:r>
+              <w:rPr>
+                <w:rFonts w:eastAsiaTheme="minorEastAsia"/>
+                <w:noProof/>
+                <w:kern w:val="2"/>
+                <w:sz w:val="24"/>
+                <w:szCs w:val="24"/>
+                <w:lang w:eastAsia="pt-BR"/>
+                <w14:ligatures w14:val="standardContextual"/>
+              </w:rPr>
+              <w:tab/>
+            </w:r>
+            <w:r>
+              <w:rPr>
+                <w:rStyle w:val="Hyperlink"/>
+                <w:rFonts w:ascii="Times New Roman" w:hAnsi="Times New Roman" w:cs="Times New Roman"/>
+                <w:i/>
+                <w:noProof/>
+              </w:rPr>
+              <w:t>MODELO LÓGICO</w:t>
+            </w:r>
+            <w:r>
+              <w:rPr>
+                <w:noProof/>
+                <w:webHidden/>
+              </w:rPr>
+              <w:tab/>
+            </w:r>
+            <w:r>
+              <w:rPr>
+                <w:noProof/>
+                <w:webHidden/>
+              </w:rPr>
+              <w:fldChar w:fldCharType="begin"/>
+            </w:r>
+            <w:r>
+              <w:rPr>
+                <w:noProof/>
+                <w:webHidden/>
+              </w:rPr>
+              <w:instrText xml:space="preserve"> PAGEREF _Toc227070584 \h </w:instrText>
+            </w:r>
+            <w:r>
+              <w:rPr>
+                <w:noProof/>
+                <w:webHidden/>
+              </w:rPr>
+            </w:r>
+            <w:r>
+              <w:rPr>
+                <w:noProof/>
+                <w:webHidden/>
+              </w:rPr>
+              <w:fldChar w:fldCharType="separate"/>
+            </w:r>
+            <w:r>
+              <w:rPr>
+                <w:noProof/>
+                <w:webHidden/>
+              </w:rPr>
+              <w:t>6</w:t>
             </w:r>
             <w:r>
               <w:rPr>
@@ -1401,7 +1499,7 @@
               <w14:ligatures w14:val="standardContextual"/>
             </w:rPr>
           </w:pPr>
-          <w:hyperlink w:anchor="_Toc225951996" w:history="1">
+          <w:hyperlink w:anchor="_Toc227070585" w:history="1">
             <w:r>
               <w:rPr>
                 <w:rStyle w:val="Hyperlink"/>
@@ -1451,7 +1549,7 @@
                 <w:noProof/>
                 <w:webHidden/>
               </w:rPr>
-              <w:instrText xml:space="preserve"> PAGEREF _Toc225951996 \h </w:instrText>
+              <w:instrText xml:space="preserve"> PAGEREF _Toc227070585 \h </w:instrText>
             </w:r>
             <w:r>
               <w:rPr>
@@ -1471,7 +1569,7 @@
                 <w:noProof/>
                 <w:webHidden/>
               </w:rPr>
-              <w:t>6</w:t>
+              <w:t>7</w:t>
             </w:r>
             <w:r>
               <w:rPr>
@@ -1499,7 +1597,7 @@
               <w14:ligatures w14:val="standardContextual"/>
             </w:rPr>
           </w:pPr>
-          <w:hyperlink w:anchor="_Toc225951997" w:history="1">
+          <w:hyperlink w:anchor="_Toc227070586" w:history="1">
             <w:r>
               <w:rPr>
                 <w:rStyle w:val="Hyperlink"/>
@@ -1549,7 +1647,7 @@
                 <w:noProof/>
                 <w:webHidden/>
               </w:rPr>
-              <w:instrText xml:space="preserve"> PAGEREF _Toc225951997 \h </w:instrText>
+              <w:instrText xml:space="preserve"> PAGEREF _Toc227070586 \h </w:instrText>
             </w:r>
             <w:r>
               <w:rPr>
@@ -1569,7 +1667,7 @@
                 <w:noProof/>
                 <w:webHidden/>
               </w:rPr>
-              <w:t>7</w:t>
+              <w:t>8</w:t>
             </w:r>
             <w:r>
               <w:rPr>
@@ -1597,7 +1695,7 @@
               <w14:ligatures w14:val="standardContextual"/>
             </w:rPr>
           </w:pPr>
-          <w:hyperlink w:anchor="_Toc225951998" w:history="1">
+          <w:hyperlink w:anchor="_Toc227070587" w:history="1">
             <w:r>
               <w:rPr>
                 <w:rStyle w:val="Hyperlink"/>
@@ -1647,7 +1745,7 @@
                 <w:noProof/>
                 <w:webHidden/>
               </w:rPr>
-              <w:instrText xml:space="preserve"> PAGEREF _Toc225951998 \h </w:instrText>
+              <w:instrText xml:space="preserve"> PAGEREF _Toc227070587 \h </w:instrText>
             </w:r>
             <w:r>
               <w:rPr>
@@ -1667,7 +1765,7 @@
                 <w:noProof/>
                 <w:webHidden/>
               </w:rPr>
-              <w:t>7</w:t>
+              <w:t>8</w:t>
             </w:r>
             <w:r>
               <w:rPr>
@@ -1695,7 +1793,7 @@
               <w14:ligatures w14:val="standardContextual"/>
             </w:rPr>
           </w:pPr>
-          <w:hyperlink w:anchor="_Toc225951999" w:history="1">
+          <w:hyperlink w:anchor="_Toc227070588" w:history="1">
             <w:r>
               <w:rPr>
                 <w:rStyle w:val="Hyperlink"/>
@@ -1745,7 +1843,7 @@
                 <w:noProof/>
                 <w:webHidden/>
               </w:rPr>
-              <w:instrText xml:space="preserve"> PAGEREF _Toc225951999 \h </w:instrText>
+              <w:instrText xml:space="preserve"> PAGEREF _Toc227070588 \h </w:instrText>
             </w:r>
             <w:r>
               <w:rPr>
@@ -1765,7 +1863,7 @@
                 <w:noProof/>
                 <w:webHidden/>
               </w:rPr>
-              <w:t>8</w:t>
+              <w:t>9</w:t>
             </w:r>
             <w:r>
               <w:rPr>
@@ -1793,7 +1891,7 @@
               <w14:ligatures w14:val="standardContextual"/>
             </w:rPr>
           </w:pPr>
-          <w:hyperlink w:anchor="_Toc225952000" w:history="1">
+          <w:hyperlink w:anchor="_Toc227070589" w:history="1">
             <w:r>
               <w:rPr>
                 <w:rStyle w:val="Hyperlink"/>
@@ -1843,7 +1941,7 @@
                 <w:noProof/>
                 <w:webHidden/>
               </w:rPr>
-              <w:instrText xml:space="preserve"> PAGEREF _Toc225952000 \h </w:instrText>
+              <w:instrText xml:space="preserve"> PAGEREF _Toc227070589 \h </w:instrText>
             </w:r>
             <w:r>
               <w:rPr>
@@ -1863,7 +1961,7 @@
                 <w:noProof/>
                 <w:webHidden/>
               </w:rPr>
-              <w:t>9</w:t>
+              <w:t>10</w:t>
             </w:r>
             <w:r>
               <w:rPr>
@@ -1936,7 +2034,7 @@
           <w:szCs w:val="24"/>
         </w:rPr>
       </w:pPr>
-      <w:bookmarkStart w:id="1" w:name="_Toc225951986"/>
+      <w:bookmarkStart w:id="1" w:name="_Toc227070574"/>
       <w:r>
         <w:rPr>
           <w:rFonts w:ascii="Times New Roman" w:hAnsi="Times New Roman" w:cs="Times New Roman"/>
@@ -2000,7 +2098,7 @@
           <w:szCs w:val="24"/>
         </w:rPr>
       </w:pPr>
-      <w:bookmarkStart w:id="2" w:name="_Toc225951987"/>
+      <w:bookmarkStart w:id="2" w:name="_Toc227070575"/>
       <w:r>
         <w:rPr>
           <w:rFonts w:ascii="Times New Roman" w:hAnsi="Times New Roman" w:cs="Times New Roman"/>
@@ -2015,7 +2113,7 @@
     </w:p>
     <w:p>
       <w:pPr>
-        <w:ind w:left="360"/>
+        <w:ind w:left="360" w:firstLine="348"/>
         <w:rPr>
           <w:rFonts w:ascii="Times New Roman" w:hAnsi="Times New Roman" w:cs="Times New Roman"/>
         </w:rPr>
@@ -2065,7 +2163,7 @@
     </w:p>
     <w:p>
       <w:pPr>
-        <w:ind w:left="360"/>
+        <w:ind w:left="360" w:firstLine="348"/>
         <w:rPr>
           <w:rFonts w:ascii="Times New Roman" w:hAnsi="Times New Roman" w:cs="Times New Roman"/>
         </w:rPr>
@@ -2103,7 +2201,7 @@
     </w:p>
     <w:p>
       <w:pPr>
-        <w:ind w:left="360"/>
+        <w:ind w:left="360" w:firstLine="348"/>
         <w:rPr>
           <w:rFonts w:ascii="Times New Roman" w:hAnsi="Times New Roman" w:cs="Times New Roman"/>
         </w:rPr>
@@ -2126,7 +2224,21 @@
         <w:rPr>
           <w:rFonts w:ascii="Times New Roman" w:hAnsi="Times New Roman" w:cs="Times New Roman"/>
         </w:rPr>
-        <w:t xml:space="preserve"> do 'PredialFix', uma plataforma de</w:t>
+        <w:t xml:space="preserve"> do '</w:t>
+      </w:r>
+      <w:proofErr w:type="spellStart"/>
+      <w:r>
+        <w:rPr>
+          <w:rFonts w:ascii="Times New Roman" w:hAnsi="Times New Roman" w:cs="Times New Roman"/>
+        </w:rPr>
+        <w:t>PredialFix</w:t>
+      </w:r>
+      <w:proofErr w:type="spellEnd"/>
+      <w:r>
+        <w:rPr>
+          <w:rFonts w:ascii="Times New Roman" w:hAnsi="Times New Roman" w:cs="Times New Roman"/>
+        </w:rPr>
+        <w:t>', uma plataforma de</w:t>
       </w:r>
       <w:r>
         <w:rPr>
@@ -2203,7 +2315,7 @@
           <w:szCs w:val="24"/>
         </w:rPr>
       </w:pPr>
-      <w:bookmarkStart w:id="3" w:name="_Toc225951988"/>
+      <w:bookmarkStart w:id="3" w:name="_Toc227070576"/>
       <w:r>
         <w:rPr>
           <w:rFonts w:ascii="Times New Roman" w:hAnsi="Times New Roman" w:cs="Times New Roman"/>
@@ -2277,7 +2389,7 @@
               </w:rPr>
             </w:pPr>
             <w:bookmarkStart w:id="4" w:name="_Toc200627507"/>
-            <w:bookmarkStart w:id="5" w:name="_Toc225951989"/>
+            <w:bookmarkStart w:id="5" w:name="_Toc227070577"/>
             <w:r>
               <w:rPr>
                 <w:rFonts w:ascii="Times New Roman" w:hAnsi="Times New Roman" w:cs="Times New Roman"/>
@@ -2683,7 +2795,7 @@
                 <w:color w:val="000000" w:themeColor="text1"/>
               </w:rPr>
             </w:pPr>
-            <w:bookmarkStart w:id="6" w:name="_Toc225951990"/>
+            <w:bookmarkStart w:id="6" w:name="_Toc227070578"/>
             <w:r>
               <w:rPr>
                 <w:rFonts w:ascii="Times New Roman" w:hAnsi="Times New Roman" w:cs="Times New Roman"/>
@@ -3366,7 +3478,7 @@
                 <w:color w:val="000000" w:themeColor="text1"/>
               </w:rPr>
             </w:pPr>
-            <w:bookmarkStart w:id="7" w:name="_Toc225951991"/>
+            <w:bookmarkStart w:id="7" w:name="_Toc227070579"/>
             <w:r>
               <w:rPr>
                 <w:rFonts w:ascii="Times New Roman" w:hAnsi="Times New Roman" w:cs="Times New Roman"/>
@@ -3636,7 +3748,7 @@
           <w:sz w:val="24"/>
         </w:rPr>
       </w:pPr>
-      <w:bookmarkStart w:id="8" w:name="_Toc225951992"/>
+      <w:bookmarkStart w:id="8" w:name="_Toc227070580"/>
       <w:r>
         <w:rPr>
           <w:rFonts w:ascii="Times New Roman" w:hAnsi="Times New Roman" w:cs="Times New Roman"/>
@@ -3882,7 +3994,7 @@
           <w:szCs w:val="24"/>
         </w:rPr>
       </w:pPr>
-      <w:bookmarkStart w:id="9" w:name="_Toc225951993"/>
+      <w:bookmarkStart w:id="9" w:name="_Toc227070581"/>
       <w:r>
         <w:rPr>
           <w:rFonts w:ascii="Times New Roman" w:hAnsi="Times New Roman" w:cs="Times New Roman"/>
@@ -4036,7 +4148,11 @@
         </w:r>
       </w:hyperlink>
     </w:p>
-    <w:p/>
+    <w:p>
+      <w:r>
+        <w:br w:type="page"/>
+      </w:r>
+    </w:p>
     <w:p>
       <w:pPr>
         <w:pStyle w:val="Ttulo1"/>
@@ -4053,7 +4169,7 @@
           <w:szCs w:val="24"/>
         </w:rPr>
       </w:pPr>
-      <w:bookmarkStart w:id="10" w:name="_Toc225951994"/>
+      <w:bookmarkStart w:id="10" w:name="_Toc227070582"/>
       <w:r>
         <w:rPr>
           <w:rFonts w:ascii="Times New Roman" w:hAnsi="Times New Roman" w:cs="Times New Roman"/>
@@ -4062,6 +4178,7 @@
           <w:sz w:val="24"/>
           <w:szCs w:val="24"/>
         </w:rPr>
+        <w:lastRenderedPageBreak/>
         <w:t>BANCO DE DADOS</w:t>
       </w:r>
       <w:bookmarkEnd w:id="10"/>
@@ -4092,6 +4209,16 @@
         </w:rPr>
         <w:t>.</w:t>
       </w:r>
+    </w:p>
+    <w:p>
+      <w:pPr>
+        <w:ind w:left="360" w:firstLine="348"/>
+        <w:rPr>
+          <w:rFonts w:ascii="Times New Roman" w:hAnsi="Times New Roman" w:cs="Times New Roman"/>
+          <w:sz w:val="24"/>
+          <w:szCs w:val="24"/>
+        </w:rPr>
+      </w:pPr>
     </w:p>
     <w:p>
       <w:pPr>
@@ -4107,7 +4234,7 @@
           <w:sz w:val="24"/>
         </w:rPr>
       </w:pPr>
-      <w:bookmarkStart w:id="11" w:name="_Toc225951995"/>
+      <w:bookmarkStart w:id="11" w:name="_Toc227070583"/>
       <w:r>
         <w:rPr>
           <w:rFonts w:ascii="Times New Roman" w:hAnsi="Times New Roman" w:cs="Times New Roman"/>
@@ -4130,14 +4257,24 @@
     </w:p>
     <w:p>
       <w:pPr>
-        <w:ind w:left="360" w:firstLine="348"/>
-      </w:pPr>
-      <w:r>
+        <w:spacing w:after="0" w:line="240" w:lineRule="auto"/>
+        <w:rPr>
+          <w:rFonts w:ascii="Times New Roman" w:eastAsia="Times New Roman" w:hAnsi="Times New Roman" w:cs="Times New Roman"/>
+          <w:sz w:val="24"/>
+          <w:szCs w:val="24"/>
+          <w:lang w:eastAsia="pt-BR"/>
+        </w:rPr>
+      </w:pPr>
+      <w:r>
+        <w:rPr>
+          <w:noProof/>
+          <w:lang w:eastAsia="pt-BR"/>
+        </w:rPr>
         <w:drawing>
-          <wp:inline distT="0" distB="0" distL="0" distR="0" wp14:anchorId="3D585202" wp14:editId="6F2D4A0E">
-            <wp:extent cx="3296093" cy="1711325"/>
-            <wp:effectExtent l="0" t="0" r="0" b="3175"/>
-            <wp:docPr id="52916362" name="Imagem 3"/>
+          <wp:inline distT="0" distB="0" distL="0" distR="0" wp14:anchorId="19F22E6E" wp14:editId="1DE57C53">
+            <wp:extent cx="3999098" cy="2647507"/>
+            <wp:effectExtent l="0" t="0" r="1905" b="635"/>
+            <wp:docPr id="1296133463" name="Imagem 1"/>
             <wp:cNvGraphicFramePr>
               <a:graphicFrameLocks xmlns:a="http://schemas.openxmlformats.org/drawingml/2006/main" noChangeAspect="1"/>
             </wp:cNvGraphicFramePr>
@@ -4145,12 +4282,12 @@
               <a:graphicData uri="http://schemas.openxmlformats.org/drawingml/2006/picture">
                 <pic:pic xmlns:pic="http://schemas.openxmlformats.org/drawingml/2006/picture">
                   <pic:nvPicPr>
-                    <pic:cNvPr id="0" name="Picture 6"/>
+                    <pic:cNvPr id="0" name="Picture 1"/>
                     <pic:cNvPicPr>
                       <a:picLocks noChangeAspect="1" noChangeArrowheads="1"/>
                     </pic:cNvPicPr>
                   </pic:nvPicPr>
-                  <pic:blipFill>
+                  <pic:blipFill rotWithShape="1">
                     <a:blip r:embed="rId11">
                       <a:extLst>
                         <a:ext uri="{28A0092B-C50C-407E-A947-70E740481C1C}">
@@ -4158,7 +4295,7 @@
                         </a:ext>
                       </a:extLst>
                     </a:blip>
-                    <a:srcRect/>
+                    <a:srcRect l="12167" t="10703" r="19860" b="11353"/>
                     <a:stretch>
                       <a:fillRect/>
                     </a:stretch>
@@ -4166,7 +4303,7 @@
                   <pic:spPr bwMode="auto">
                     <a:xfrm>
                       <a:off x="0" y="0"/>
-                      <a:ext cx="3333237" cy="1730610"/>
+                      <a:ext cx="4079516" cy="2700746"/>
                     </a:xfrm>
                     <a:prstGeom prst="rect">
                       <a:avLst/>
@@ -4175,6 +4312,11 @@
                     <a:ln>
                       <a:noFill/>
                     </a:ln>
+                    <a:extLst>
+                      <a:ext uri="{53640926-AAD7-44D8-BBD7-CCE9431645EC}">
+                        <a14:shadowObscured xmlns:a14="http://schemas.microsoft.com/office/drawing/2010/main"/>
+                      </a:ext>
+                    </a:extLst>
                   </pic:spPr>
                 </pic:pic>
               </a:graphicData>
@@ -4187,23 +4329,108 @@
       <w:pPr>
         <w:ind w:left="360" w:firstLine="348"/>
       </w:pPr>
-      <w:r>
-        <w:br w:type="page"/>
-      </w:r>
     </w:p>
     <w:p>
       <w:pPr>
-        <w:spacing w:after="0"/>
-        <w:ind w:firstLine="360"/>
-        <w:jc w:val="both"/>
-        <w:rPr>
-          <w:rFonts w:ascii="Times New Roman" w:hAnsi="Times New Roman" w:cs="Times New Roman"/>
+        <w:pStyle w:val="Ttulo2"/>
+        <w:numPr>
+          <w:ilvl w:val="1"/>
+          <w:numId w:val="3"/>
+        </w:numPr>
+        <w:rPr>
+          <w:rFonts w:ascii="Times New Roman" w:hAnsi="Times New Roman" w:cs="Times New Roman"/>
+          <w:i/>
+          <w:color w:val="auto"/>
+          <w:sz w:val="24"/>
+        </w:rPr>
+      </w:pPr>
+      <w:bookmarkStart w:id="12" w:name="_Toc227070584"/>
+      <w:r>
+        <w:rPr>
+          <w:rFonts w:ascii="Times New Roman" w:hAnsi="Times New Roman" w:cs="Times New Roman"/>
+          <w:i/>
+          <w:color w:val="auto"/>
+          <w:sz w:val="24"/>
+        </w:rPr>
+        <w:t>MODELO LÓGICO</w:t>
+      </w:r>
+      <w:bookmarkEnd w:id="12"/>
+    </w:p>
+    <w:p>
+      <w:pPr>
+        <w:spacing w:after="0" w:line="240" w:lineRule="auto"/>
+        <w:rPr>
+          <w:rFonts w:ascii="Times New Roman" w:eastAsia="Times New Roman" w:hAnsi="Times New Roman" w:cs="Times New Roman"/>
           <w:sz w:val="24"/>
           <w:szCs w:val="24"/>
-        </w:rPr>
-      </w:pPr>
+          <w:lang w:eastAsia="pt-BR"/>
+        </w:rPr>
+      </w:pPr>
+      <w:r>
+        <w:rPr>
+          <w:noProof/>
+          <w:lang w:eastAsia="pt-BR"/>
+        </w:rPr>
+        <w:drawing>
+          <wp:inline distT="0" distB="0" distL="0" distR="0" wp14:anchorId="2D7D2C4D" wp14:editId="2CF2A3AE">
+            <wp:extent cx="2902083" cy="2381693"/>
+            <wp:effectExtent l="0" t="0" r="0" b="0"/>
+            <wp:docPr id="539824076" name="Imagem 2"/>
+            <wp:cNvGraphicFramePr>
+              <a:graphicFrameLocks xmlns:a="http://schemas.openxmlformats.org/drawingml/2006/main" noChangeAspect="1"/>
+            </wp:cNvGraphicFramePr>
+            <a:graphic xmlns:a="http://schemas.openxmlformats.org/drawingml/2006/main">
+              <a:graphicData uri="http://schemas.openxmlformats.org/drawingml/2006/picture">
+                <pic:pic xmlns:pic="http://schemas.openxmlformats.org/drawingml/2006/picture">
+                  <pic:nvPicPr>
+                    <pic:cNvPr id="0" name="Picture 3"/>
+                    <pic:cNvPicPr>
+                      <a:picLocks noChangeAspect="1" noChangeArrowheads="1"/>
+                    </pic:cNvPicPr>
+                  </pic:nvPicPr>
+                  <pic:blipFill rotWithShape="1">
+                    <a:blip r:embed="rId12">
+                      <a:extLst>
+                        <a:ext uri="{28A0092B-C50C-407E-A947-70E740481C1C}">
+                          <a14:useLocalDpi xmlns:a14="http://schemas.microsoft.com/office/drawing/2010/main" val="0"/>
+                        </a:ext>
+                      </a:extLst>
+                    </a:blip>
+                    <a:srcRect l="10058" t="13184" r="13682" b="14770"/>
+                    <a:stretch>
+                      <a:fillRect/>
+                    </a:stretch>
+                  </pic:blipFill>
+                  <pic:spPr bwMode="auto">
+                    <a:xfrm>
+                      <a:off x="0" y="0"/>
+                      <a:ext cx="2902618" cy="2382132"/>
+                    </a:xfrm>
+                    <a:prstGeom prst="rect">
+                      <a:avLst/>
+                    </a:prstGeom>
+                    <a:noFill/>
+                    <a:ln>
+                      <a:noFill/>
+                    </a:ln>
+                    <a:extLst>
+                      <a:ext uri="{53640926-AAD7-44D8-BBD7-CCE9431645EC}">
+                        <a14:shadowObscured xmlns:a14="http://schemas.microsoft.com/office/drawing/2010/main"/>
+                      </a:ext>
+                    </a:extLst>
+                  </pic:spPr>
+                </pic:pic>
+              </a:graphicData>
+            </a:graphic>
+          </wp:inline>
+        </w:drawing>
+      </w:r>
     </w:p>
-    <w:p/>
+    <w:p>
+      <w:pPr>
+        <w:ind w:left="360" w:firstLine="348"/>
+      </w:pPr>
+    </w:p>
     <w:p>
       <w:pPr>
         <w:pStyle w:val="Ttulo1"/>
@@ -4212,7 +4439,7 @@
           <w:numId w:val="3"/>
         </w:numPr>
       </w:pPr>
-      <w:bookmarkStart w:id="12" w:name="_Toc225951996"/>
+      <w:bookmarkStart w:id="13" w:name="_Toc227070585"/>
       <w:r>
         <w:rPr>
           <w:rFonts w:ascii="Times New Roman" w:hAnsi="Times New Roman" w:cs="Times New Roman"/>
@@ -4221,6 +4448,7 @@
           <w:sz w:val="24"/>
           <w:szCs w:val="24"/>
         </w:rPr>
+        <w:lastRenderedPageBreak/>
         <w:t>P</w:t>
       </w:r>
       <w:r>
@@ -4233,7 +4461,7 @@
         </w:rPr>
         <w:t>ROTOTIPAGEM</w:t>
       </w:r>
-      <w:bookmarkEnd w:id="12"/>
+      <w:bookmarkEnd w:id="13"/>
     </w:p>
     <w:p>
       <w:pPr>
@@ -4328,7 +4556,7 @@
                     </pic:cNvPicPr>
                   </pic:nvPicPr>
                   <pic:blipFill>
-                    <a:blip r:embed="rId12" cstate="print">
+                    <a:blip r:embed="rId13" cstate="print">
                       <a:extLst>
                         <a:ext uri="{28A0092B-C50C-407E-A947-70E740481C1C}">
                           <a14:useLocalDpi xmlns:a14="http://schemas.microsoft.com/office/drawing/2010/main" val="0"/>
@@ -4378,7 +4606,7 @@
       <w:r>
         <w:br w:type="page"/>
       </w:r>
-      <w:bookmarkStart w:id="13" w:name="_Toc225951997"/>
+      <w:bookmarkStart w:id="14" w:name="_Toc227070586"/>
       <w:r>
         <w:rPr>
           <w:rFonts w:ascii="Times New Roman" w:hAnsi="Times New Roman" w:cs="Times New Roman"/>
@@ -4400,7 +4628,7 @@
         </w:rPr>
         <w:t>IAGRAMAS</w:t>
       </w:r>
-      <w:bookmarkEnd w:id="13"/>
+      <w:bookmarkEnd w:id="14"/>
     </w:p>
     <w:p>
       <w:pPr>
@@ -4416,7 +4644,7 @@
           <w:sz w:val="24"/>
         </w:rPr>
       </w:pPr>
-      <w:bookmarkStart w:id="14" w:name="_Toc225951998"/>
+      <w:bookmarkStart w:id="15" w:name="_Toc227070587"/>
       <w:r>
         <w:rPr>
           <w:rFonts w:ascii="Times New Roman" w:hAnsi="Times New Roman" w:cs="Times New Roman"/>
@@ -4435,7 +4663,7 @@
         </w:rPr>
         <w:t>IAGRAMA DE CLASSE</w:t>
       </w:r>
-      <w:bookmarkEnd w:id="14"/>
+      <w:bookmarkEnd w:id="15"/>
     </w:p>
     <w:p>
       <w:pPr>
@@ -4487,7 +4715,7 @@
                     </pic:cNvPicPr>
                   </pic:nvPicPr>
                   <pic:blipFill>
-                    <a:blip r:embed="rId13">
+                    <a:blip r:embed="rId14">
                       <a:extLst>
                         <a:ext uri="{28A0092B-C50C-407E-A947-70E740481C1C}">
                           <a14:useLocalDpi xmlns:a14="http://schemas.microsoft.com/office/drawing/2010/main" val="0"/>
@@ -4537,7 +4765,7 @@
           <w:sz w:val="24"/>
         </w:rPr>
       </w:pPr>
-      <w:bookmarkStart w:id="15" w:name="_Toc225951999"/>
+      <w:bookmarkStart w:id="16" w:name="_Toc227070588"/>
       <w:r>
         <w:rPr>
           <w:rFonts w:ascii="Times New Roman" w:hAnsi="Times New Roman" w:cs="Times New Roman"/>
@@ -4556,7 +4784,7 @@
         </w:rPr>
         <w:t>IAGRAMA DE SEQUÊNCIA</w:t>
       </w:r>
-      <w:bookmarkEnd w:id="15"/>
+      <w:bookmarkEnd w:id="16"/>
     </w:p>
     <w:p/>
     <w:p>
@@ -4616,7 +4844,7 @@
                     </pic:cNvPicPr>
                   </pic:nvPicPr>
                   <pic:blipFill>
-                    <a:blip r:embed="rId14">
+                    <a:blip r:embed="rId15">
                       <a:extLst>
                         <a:ext uri="{28A0092B-C50C-407E-A947-70E740481C1C}">
                           <a14:useLocalDpi xmlns:a14="http://schemas.microsoft.com/office/drawing/2010/main" val="0"/>
@@ -4668,7 +4896,7 @@
           <w:szCs w:val="24"/>
         </w:rPr>
       </w:pPr>
-      <w:bookmarkStart w:id="16" w:name="_Toc225952000"/>
+      <w:bookmarkStart w:id="17" w:name="_Toc227070589"/>
       <w:r>
         <w:rPr>
           <w:rFonts w:ascii="Times New Roman" w:hAnsi="Times New Roman" w:cs="Times New Roman"/>
@@ -4679,12 +4907,12 @@
         </w:rPr>
         <w:t>CONCLUSÃO</w:t>
       </w:r>
-      <w:bookmarkEnd w:id="16"/>
+      <w:bookmarkEnd w:id="17"/>
     </w:p>
     <w:p/>
     <w:p/>
     <w:sectPr>
-      <w:footerReference w:type="default" r:id="rId15"/>
+      <w:footerReference w:type="default" r:id="rId16"/>
       <w:pgSz w:w="11906" w:h="16838"/>
       <w:pgMar w:top="1417" w:right="1701" w:bottom="1417" w:left="1701" w:header="708" w:footer="708" w:gutter="0"/>
       <w:pgNumType w:start="1"/>
@@ -8376,6 +8604,7 @@
   <w:style w:type="character" w:default="1" w:styleId="Fontepargpadro">
     <w:name w:val="Default Paragraph Font"/>
     <w:uiPriority w:val="1"/>
+    <w:semiHidden/>
     <w:unhideWhenUsed/>
   </w:style>
   <w:style w:type="table" w:default="1" w:styleId="Tabelanormal">

</xml_diff>